<commit_message>
Docs: ERS-01 v1.3, CU-01 v2.4 e HU-17 con la API de materiales - Camila Olivares
Caso CU-REP-08, diagrama del paquete 10 y avance del Sprint 3 al 22-10.
</commit_message>
<xml_diff>
--- a/Fase 2/Evidencias Proyecto/Evidencias de documentación/1. Inicio del proyecto/SITRAFO_ERS-01_Toma_de_Requerimientos.docx
+++ b/Fase 2/Evidencias Proyecto/Evidencias de documentación/1. Inicio del proyecto/SITRAFO_ERS-01_Toma_de_Requerimientos.docx
@@ -75,7 +75,7 @@
         <w:rPr>
           <w:color w:val="7F7F7F"/>
         </w:rPr>
-        <w:t>ERS-01  ·  Versión 1.2</w:t>
+        <w:t xml:space="preserve">ERS-01  ·  Versión 1.3</w:t>
       </w:r>
     </w:p>
     <w:tbl>
@@ -628,69 +628,36 @@
             <w:tabs>
               <w:tab w:val="right" w:leader="dot" w:pos="9350"/>
             </w:tabs>
-            <w:rPr>
-              <w:rFonts w:asciiTheme="minorHAnsi" w:eastAsiaTheme="minorEastAsia" w:hAnsiTheme="minorHAnsi" w:cstheme="minorBidi"/>
-              <w:noProof/>
-              <w:color w:val="auto"/>
-              <w:lang w:val="es-CL" w:eastAsia="es-CL"/>
-            </w:rPr>
           </w:pPr>
           <w:r>
             <w:fldChar w:fldCharType="begin"/>
           </w:r>
           <w:r>
-            <w:instrText>TOC \h \o "1-2"</w:instrText>
+            <w:instrText xml:space="preserve">TOC \h \o "1-2"</w:instrText>
           </w:r>
           <w:r>
             <w:fldChar w:fldCharType="separate"/>
           </w:r>
           <w:hyperlink w:anchor="_Toc243417808" w:history="1">
             <w:r>
-              <w:rPr>
-                <w:rStyle w:val="Hipervnculo"/>
-                <w:noProof/>
-              </w:rPr>
-              <w:t>Tabla de contenidos</w:t>
-            </w:r>
-            <w:r>
-              <w:rPr>
-                <w:noProof/>
-              </w:rPr>
+              <w:t xml:space="preserve">Tabla de contenidos</w:t>
+            </w:r>
+            <w:r>
               <w:tab/>
             </w:r>
             <w:r>
-              <w:rPr>
-                <w:noProof/>
-              </w:rPr>
               <w:fldChar w:fldCharType="begin"/>
             </w:r>
             <w:r>
-              <w:rPr>
-                <w:noProof/>
-              </w:rPr>
               <w:instrText xml:space="preserve"> PAGEREF _Toc243417808 \h </w:instrText>
             </w:r>
             <w:r>
-              <w:rPr>
-                <w:noProof/>
-              </w:rPr>
-            </w:r>
-            <w:r>
-              <w:rPr>
-                <w:noProof/>
-              </w:rPr>
               <w:fldChar w:fldCharType="separate"/>
             </w:r>
             <w:r>
-              <w:rPr>
-                <w:noProof/>
-              </w:rPr>
               <w:t>2</w:t>
             </w:r>
             <w:r>
-              <w:rPr>
-                <w:noProof/>
-              </w:rPr>
               <w:fldChar w:fldCharType="end"/>
             </w:r>
           </w:hyperlink>
@@ -701,60 +668,27 @@
             <w:tabs>
               <w:tab w:val="right" w:leader="dot" w:pos="9350"/>
             </w:tabs>
-            <w:rPr>
-              <w:rFonts w:asciiTheme="minorHAnsi" w:eastAsiaTheme="minorEastAsia" w:hAnsiTheme="minorHAnsi" w:cstheme="minorBidi"/>
-              <w:noProof/>
-              <w:color w:val="auto"/>
-              <w:lang w:val="es-CL" w:eastAsia="es-CL"/>
-            </w:rPr>
           </w:pPr>
           <w:hyperlink w:anchor="_Toc243417809" w:history="1">
             <w:r>
-              <w:rPr>
-                <w:rStyle w:val="Hipervnculo"/>
-                <w:noProof/>
-              </w:rPr>
-              <w:t>1. Propósito y alcance del documento</w:t>
-            </w:r>
-            <w:r>
-              <w:rPr>
-                <w:noProof/>
-              </w:rPr>
+              <w:t xml:space="preserve">1. Propósito y alcance del documento</w:t>
+            </w:r>
+            <w:r>
               <w:tab/>
             </w:r>
             <w:r>
-              <w:rPr>
-                <w:noProof/>
-              </w:rPr>
               <w:fldChar w:fldCharType="begin"/>
             </w:r>
             <w:r>
-              <w:rPr>
-                <w:noProof/>
-              </w:rPr>
               <w:instrText xml:space="preserve"> PAGEREF _Toc243417809 \h </w:instrText>
             </w:r>
             <w:r>
-              <w:rPr>
-                <w:noProof/>
-              </w:rPr>
-            </w:r>
-            <w:r>
-              <w:rPr>
-                <w:noProof/>
-              </w:rPr>
               <w:fldChar w:fldCharType="separate"/>
             </w:r>
             <w:r>
-              <w:rPr>
-                <w:noProof/>
-              </w:rPr>
               <w:t>3</w:t>
             </w:r>
             <w:r>
-              <w:rPr>
-                <w:noProof/>
-              </w:rPr>
               <w:fldChar w:fldCharType="end"/>
             </w:r>
           </w:hyperlink>
@@ -765,60 +699,27 @@
             <w:tabs>
               <w:tab w:val="right" w:leader="dot" w:pos="9350"/>
             </w:tabs>
-            <w:rPr>
-              <w:rFonts w:asciiTheme="minorHAnsi" w:eastAsiaTheme="minorEastAsia" w:hAnsiTheme="minorHAnsi" w:cstheme="minorBidi"/>
-              <w:noProof/>
-              <w:color w:val="auto"/>
-              <w:lang w:val="es-CL" w:eastAsia="es-CL"/>
-            </w:rPr>
           </w:pPr>
           <w:hyperlink w:anchor="_Toc243417810" w:history="1">
             <w:r>
-              <w:rPr>
-                <w:rStyle w:val="Hipervnculo"/>
-                <w:noProof/>
-              </w:rPr>
-              <w:t>2. Fuentes y técnicas de elicitación</w:t>
-            </w:r>
-            <w:r>
-              <w:rPr>
-                <w:noProof/>
-              </w:rPr>
+              <w:t xml:space="preserve">2. Fuentes y técnicas de elicitación</w:t>
+            </w:r>
+            <w:r>
               <w:tab/>
             </w:r>
             <w:r>
-              <w:rPr>
-                <w:noProof/>
-              </w:rPr>
               <w:fldChar w:fldCharType="begin"/>
             </w:r>
             <w:r>
-              <w:rPr>
-                <w:noProof/>
-              </w:rPr>
               <w:instrText xml:space="preserve"> PAGEREF _Toc243417810 \h </w:instrText>
             </w:r>
             <w:r>
-              <w:rPr>
-                <w:noProof/>
-              </w:rPr>
-            </w:r>
-            <w:r>
-              <w:rPr>
-                <w:noProof/>
-              </w:rPr>
               <w:fldChar w:fldCharType="separate"/>
             </w:r>
             <w:r>
-              <w:rPr>
-                <w:noProof/>
-              </w:rPr>
               <w:t>3</w:t>
             </w:r>
             <w:r>
-              <w:rPr>
-                <w:noProof/>
-              </w:rPr>
               <w:fldChar w:fldCharType="end"/>
             </w:r>
           </w:hyperlink>
@@ -829,60 +730,27 @@
             <w:tabs>
               <w:tab w:val="right" w:leader="dot" w:pos="9350"/>
             </w:tabs>
-            <w:rPr>
-              <w:rFonts w:asciiTheme="minorHAnsi" w:eastAsiaTheme="minorEastAsia" w:hAnsiTheme="minorHAnsi" w:cstheme="minorBidi"/>
-              <w:noProof/>
-              <w:color w:val="auto"/>
-              <w:lang w:val="es-CL" w:eastAsia="es-CL"/>
-            </w:rPr>
           </w:pPr>
           <w:hyperlink w:anchor="_Toc243417811" w:history="1">
             <w:r>
-              <w:rPr>
-                <w:rStyle w:val="Hipervnculo"/>
-                <w:noProof/>
-              </w:rPr>
-              <w:t>3. Contexto del negocio</w:t>
-            </w:r>
-            <w:r>
-              <w:rPr>
-                <w:noProof/>
-              </w:rPr>
+              <w:t xml:space="preserve">3. Contexto del negocio</w:t>
+            </w:r>
+            <w:r>
               <w:tab/>
             </w:r>
             <w:r>
-              <w:rPr>
-                <w:noProof/>
-              </w:rPr>
               <w:fldChar w:fldCharType="begin"/>
             </w:r>
             <w:r>
-              <w:rPr>
-                <w:noProof/>
-              </w:rPr>
               <w:instrText xml:space="preserve"> PAGEREF _Toc243417811 \h </w:instrText>
             </w:r>
             <w:r>
-              <w:rPr>
-                <w:noProof/>
-              </w:rPr>
-            </w:r>
-            <w:r>
-              <w:rPr>
-                <w:noProof/>
-              </w:rPr>
               <w:fldChar w:fldCharType="separate"/>
             </w:r>
             <w:r>
-              <w:rPr>
-                <w:noProof/>
-              </w:rPr>
               <w:t>3</w:t>
             </w:r>
             <w:r>
-              <w:rPr>
-                <w:noProof/>
-              </w:rPr>
               <w:fldChar w:fldCharType="end"/>
             </w:r>
           </w:hyperlink>
@@ -893,60 +761,27 @@
             <w:tabs>
               <w:tab w:val="right" w:leader="dot" w:pos="9350"/>
             </w:tabs>
-            <w:rPr>
-              <w:rFonts w:asciiTheme="minorHAnsi" w:eastAsiaTheme="minorEastAsia" w:hAnsiTheme="minorHAnsi" w:cstheme="minorBidi"/>
-              <w:noProof/>
-              <w:color w:val="auto"/>
-              <w:lang w:val="es-CL" w:eastAsia="es-CL"/>
-            </w:rPr>
           </w:pPr>
           <w:hyperlink w:anchor="_Toc243417812" w:history="1">
             <w:r>
-              <w:rPr>
-                <w:rStyle w:val="Hipervnculo"/>
-                <w:noProof/>
-              </w:rPr>
-              <w:t>4. Actores del sistema</w:t>
-            </w:r>
-            <w:r>
-              <w:rPr>
-                <w:noProof/>
-              </w:rPr>
+              <w:t xml:space="preserve">4. Actores del sistema</w:t>
+            </w:r>
+            <w:r>
               <w:tab/>
             </w:r>
             <w:r>
-              <w:rPr>
-                <w:noProof/>
-              </w:rPr>
               <w:fldChar w:fldCharType="begin"/>
             </w:r>
             <w:r>
-              <w:rPr>
-                <w:noProof/>
-              </w:rPr>
               <w:instrText xml:space="preserve"> PAGEREF _Toc243417812 \h </w:instrText>
             </w:r>
             <w:r>
-              <w:rPr>
-                <w:noProof/>
-              </w:rPr>
-            </w:r>
-            <w:r>
-              <w:rPr>
-                <w:noProof/>
-              </w:rPr>
               <w:fldChar w:fldCharType="separate"/>
             </w:r>
             <w:r>
-              <w:rPr>
-                <w:noProof/>
-              </w:rPr>
               <w:t>4</w:t>
             </w:r>
             <w:r>
-              <w:rPr>
-                <w:noProof/>
-              </w:rPr>
               <w:fldChar w:fldCharType="end"/>
             </w:r>
           </w:hyperlink>
@@ -957,60 +792,27 @@
             <w:tabs>
               <w:tab w:val="right" w:leader="dot" w:pos="9350"/>
             </w:tabs>
-            <w:rPr>
-              <w:rFonts w:asciiTheme="minorHAnsi" w:eastAsiaTheme="minorEastAsia" w:hAnsiTheme="minorHAnsi" w:cstheme="minorBidi"/>
-              <w:noProof/>
-              <w:color w:val="auto"/>
-              <w:lang w:val="es-CL" w:eastAsia="es-CL"/>
-            </w:rPr>
           </w:pPr>
           <w:hyperlink w:anchor="_Toc243417813" w:history="1">
             <w:r>
-              <w:rPr>
-                <w:rStyle w:val="Hipervnculo"/>
-                <w:noProof/>
-              </w:rPr>
-              <w:t>4.1 Actores humanos</w:t>
-            </w:r>
-            <w:r>
-              <w:rPr>
-                <w:noProof/>
-              </w:rPr>
+              <w:t xml:space="preserve">4.1 Actores humanos</w:t>
+            </w:r>
+            <w:r>
               <w:tab/>
             </w:r>
             <w:r>
-              <w:rPr>
-                <w:noProof/>
-              </w:rPr>
               <w:fldChar w:fldCharType="begin"/>
             </w:r>
             <w:r>
-              <w:rPr>
-                <w:noProof/>
-              </w:rPr>
               <w:instrText xml:space="preserve"> PAGEREF _Toc243417813 \h </w:instrText>
             </w:r>
             <w:r>
-              <w:rPr>
-                <w:noProof/>
-              </w:rPr>
-            </w:r>
-            <w:r>
-              <w:rPr>
-                <w:noProof/>
-              </w:rPr>
               <w:fldChar w:fldCharType="separate"/>
             </w:r>
             <w:r>
-              <w:rPr>
-                <w:noProof/>
-              </w:rPr>
               <w:t>4</w:t>
             </w:r>
             <w:r>
-              <w:rPr>
-                <w:noProof/>
-              </w:rPr>
               <w:fldChar w:fldCharType="end"/>
             </w:r>
           </w:hyperlink>
@@ -1021,60 +823,27 @@
             <w:tabs>
               <w:tab w:val="right" w:leader="dot" w:pos="9350"/>
             </w:tabs>
-            <w:rPr>
-              <w:rFonts w:asciiTheme="minorHAnsi" w:eastAsiaTheme="minorEastAsia" w:hAnsiTheme="minorHAnsi" w:cstheme="minorBidi"/>
-              <w:noProof/>
-              <w:color w:val="auto"/>
-              <w:lang w:val="es-CL" w:eastAsia="es-CL"/>
-            </w:rPr>
           </w:pPr>
           <w:hyperlink w:anchor="_Toc243417814" w:history="1">
             <w:r>
-              <w:rPr>
-                <w:rStyle w:val="Hipervnculo"/>
-                <w:noProof/>
-              </w:rPr>
-              <w:t>4.2 Actores sistema (servicios externos)</w:t>
-            </w:r>
-            <w:r>
-              <w:rPr>
-                <w:noProof/>
-              </w:rPr>
+              <w:t xml:space="preserve">4.2 Actores sistema (servicios externos)</w:t>
+            </w:r>
+            <w:r>
               <w:tab/>
             </w:r>
             <w:r>
-              <w:rPr>
-                <w:noProof/>
-              </w:rPr>
               <w:fldChar w:fldCharType="begin"/>
             </w:r>
             <w:r>
-              <w:rPr>
-                <w:noProof/>
-              </w:rPr>
               <w:instrText xml:space="preserve"> PAGEREF _Toc243417814 \h </w:instrText>
             </w:r>
             <w:r>
-              <w:rPr>
-                <w:noProof/>
-              </w:rPr>
-            </w:r>
-            <w:r>
-              <w:rPr>
-                <w:noProof/>
-              </w:rPr>
               <w:fldChar w:fldCharType="separate"/>
             </w:r>
             <w:r>
-              <w:rPr>
-                <w:noProof/>
-              </w:rPr>
               <w:t>5</w:t>
             </w:r>
             <w:r>
-              <w:rPr>
-                <w:noProof/>
-              </w:rPr>
               <w:fldChar w:fldCharType="end"/>
             </w:r>
           </w:hyperlink>
@@ -1085,60 +854,27 @@
             <w:tabs>
               <w:tab w:val="right" w:leader="dot" w:pos="9350"/>
             </w:tabs>
-            <w:rPr>
-              <w:rFonts w:asciiTheme="minorHAnsi" w:eastAsiaTheme="minorEastAsia" w:hAnsiTheme="minorHAnsi" w:cstheme="minorBidi"/>
-              <w:noProof/>
-              <w:color w:val="auto"/>
-              <w:lang w:val="es-CL" w:eastAsia="es-CL"/>
-            </w:rPr>
           </w:pPr>
           <w:hyperlink w:anchor="_Toc243417815" w:history="1">
             <w:r>
-              <w:rPr>
-                <w:rStyle w:val="Hipervnculo"/>
-                <w:noProof/>
-              </w:rPr>
-              <w:t>5. Reglas de negocio</w:t>
-            </w:r>
-            <w:r>
-              <w:rPr>
-                <w:noProof/>
-              </w:rPr>
+              <w:t xml:space="preserve">5. Reglas de negocio</w:t>
+            </w:r>
+            <w:r>
               <w:tab/>
             </w:r>
             <w:r>
-              <w:rPr>
-                <w:noProof/>
-              </w:rPr>
               <w:fldChar w:fldCharType="begin"/>
             </w:r>
             <w:r>
-              <w:rPr>
-                <w:noProof/>
-              </w:rPr>
               <w:instrText xml:space="preserve"> PAGEREF _Toc243417815 \h </w:instrText>
             </w:r>
             <w:r>
-              <w:rPr>
-                <w:noProof/>
-              </w:rPr>
-            </w:r>
-            <w:r>
-              <w:rPr>
-                <w:noProof/>
-              </w:rPr>
               <w:fldChar w:fldCharType="separate"/>
             </w:r>
             <w:r>
-              <w:rPr>
-                <w:noProof/>
-              </w:rPr>
               <w:t>6</w:t>
             </w:r>
             <w:r>
-              <w:rPr>
-                <w:noProof/>
-              </w:rPr>
               <w:fldChar w:fldCharType="end"/>
             </w:r>
           </w:hyperlink>
@@ -1149,60 +885,27 @@
             <w:tabs>
               <w:tab w:val="right" w:leader="dot" w:pos="9350"/>
             </w:tabs>
-            <w:rPr>
-              <w:rFonts w:asciiTheme="minorHAnsi" w:eastAsiaTheme="minorEastAsia" w:hAnsiTheme="minorHAnsi" w:cstheme="minorBidi"/>
-              <w:noProof/>
-              <w:color w:val="auto"/>
-              <w:lang w:val="es-CL" w:eastAsia="es-CL"/>
-            </w:rPr>
           </w:pPr>
           <w:hyperlink w:anchor="_Toc243417816" w:history="1">
             <w:r>
-              <w:rPr>
-                <w:rStyle w:val="Hipervnculo"/>
-                <w:noProof/>
-              </w:rPr>
-              <w:t>6. Requerimientos funcionales</w:t>
-            </w:r>
-            <w:r>
-              <w:rPr>
-                <w:noProof/>
-              </w:rPr>
+              <w:t xml:space="preserve">6. Requerimientos funcionales</w:t>
+            </w:r>
+            <w:r>
               <w:tab/>
             </w:r>
             <w:r>
-              <w:rPr>
-                <w:noProof/>
-              </w:rPr>
               <w:fldChar w:fldCharType="begin"/>
             </w:r>
             <w:r>
-              <w:rPr>
-                <w:noProof/>
-              </w:rPr>
               <w:instrText xml:space="preserve"> PAGEREF _Toc243417816 \h </w:instrText>
             </w:r>
             <w:r>
-              <w:rPr>
-                <w:noProof/>
-              </w:rPr>
-            </w:r>
-            <w:r>
-              <w:rPr>
-                <w:noProof/>
-              </w:rPr>
               <w:fldChar w:fldCharType="separate"/>
             </w:r>
             <w:r>
-              <w:rPr>
-                <w:noProof/>
-              </w:rPr>
               <w:t>8</w:t>
             </w:r>
             <w:r>
-              <w:rPr>
-                <w:noProof/>
-              </w:rPr>
               <w:fldChar w:fldCharType="end"/>
             </w:r>
           </w:hyperlink>
@@ -1213,60 +916,27 @@
             <w:tabs>
               <w:tab w:val="right" w:leader="dot" w:pos="9350"/>
             </w:tabs>
-            <w:rPr>
-              <w:rFonts w:asciiTheme="minorHAnsi" w:eastAsiaTheme="minorEastAsia" w:hAnsiTheme="minorHAnsi" w:cstheme="minorBidi"/>
-              <w:noProof/>
-              <w:color w:val="auto"/>
-              <w:lang w:val="es-CL" w:eastAsia="es-CL"/>
-            </w:rPr>
           </w:pPr>
           <w:hyperlink w:anchor="_Toc243417817" w:history="1">
             <w:r>
-              <w:rPr>
-                <w:rStyle w:val="Hipervnculo"/>
-                <w:noProof/>
-              </w:rPr>
-              <w:t>6.1 Seguridad, roles y auditoría</w:t>
-            </w:r>
-            <w:r>
-              <w:rPr>
-                <w:noProof/>
-              </w:rPr>
+              <w:t xml:space="preserve">6.1 Seguridad, roles y auditoría</w:t>
+            </w:r>
+            <w:r>
               <w:tab/>
             </w:r>
             <w:r>
-              <w:rPr>
-                <w:noProof/>
-              </w:rPr>
               <w:fldChar w:fldCharType="begin"/>
             </w:r>
             <w:r>
-              <w:rPr>
-                <w:noProof/>
-              </w:rPr>
               <w:instrText xml:space="preserve"> PAGEREF _Toc243417817 \h </w:instrText>
             </w:r>
             <w:r>
-              <w:rPr>
-                <w:noProof/>
-              </w:rPr>
-            </w:r>
-            <w:r>
-              <w:rPr>
-                <w:noProof/>
-              </w:rPr>
               <w:fldChar w:fldCharType="separate"/>
             </w:r>
             <w:r>
-              <w:rPr>
-                <w:noProof/>
-              </w:rPr>
               <w:t>8</w:t>
             </w:r>
             <w:r>
-              <w:rPr>
-                <w:noProof/>
-              </w:rPr>
               <w:fldChar w:fldCharType="end"/>
             </w:r>
           </w:hyperlink>
@@ -1277,60 +947,27 @@
             <w:tabs>
               <w:tab w:val="right" w:leader="dot" w:pos="9350"/>
             </w:tabs>
-            <w:rPr>
-              <w:rFonts w:asciiTheme="minorHAnsi" w:eastAsiaTheme="minorEastAsia" w:hAnsiTheme="minorHAnsi" w:cstheme="minorBidi"/>
-              <w:noProof/>
-              <w:color w:val="auto"/>
-              <w:lang w:val="es-CL" w:eastAsia="es-CL"/>
-            </w:rPr>
           </w:pPr>
           <w:hyperlink w:anchor="_Toc243417818" w:history="1">
             <w:r>
-              <w:rPr>
-                <w:rStyle w:val="Hipervnculo"/>
-                <w:noProof/>
-              </w:rPr>
-              <w:t>6.2 Clientes</w:t>
-            </w:r>
-            <w:r>
-              <w:rPr>
-                <w:noProof/>
-              </w:rPr>
+              <w:t xml:space="preserve">6.2 Clientes</w:t>
+            </w:r>
+            <w:r>
               <w:tab/>
             </w:r>
             <w:r>
-              <w:rPr>
-                <w:noProof/>
-              </w:rPr>
               <w:fldChar w:fldCharType="begin"/>
             </w:r>
             <w:r>
-              <w:rPr>
-                <w:noProof/>
-              </w:rPr>
               <w:instrText xml:space="preserve"> PAGEREF _Toc243417818 \h </w:instrText>
             </w:r>
             <w:r>
-              <w:rPr>
-                <w:noProof/>
-              </w:rPr>
-            </w:r>
-            <w:r>
-              <w:rPr>
-                <w:noProof/>
-              </w:rPr>
               <w:fldChar w:fldCharType="separate"/>
             </w:r>
             <w:r>
-              <w:rPr>
-                <w:noProof/>
-              </w:rPr>
               <w:t>8</w:t>
             </w:r>
             <w:r>
-              <w:rPr>
-                <w:noProof/>
-              </w:rPr>
               <w:fldChar w:fldCharType="end"/>
             </w:r>
           </w:hyperlink>
@@ -1341,60 +978,27 @@
             <w:tabs>
               <w:tab w:val="right" w:leader="dot" w:pos="9350"/>
             </w:tabs>
-            <w:rPr>
-              <w:rFonts w:asciiTheme="minorHAnsi" w:eastAsiaTheme="minorEastAsia" w:hAnsiTheme="minorHAnsi" w:cstheme="minorBidi"/>
-              <w:noProof/>
-              <w:color w:val="auto"/>
-              <w:lang w:val="es-CL" w:eastAsia="es-CL"/>
-            </w:rPr>
           </w:pPr>
           <w:hyperlink w:anchor="_Toc243417819" w:history="1">
             <w:r>
-              <w:rPr>
-                <w:rStyle w:val="Hipervnculo"/>
-                <w:noProof/>
-              </w:rPr>
-              <w:t>6.3 Catálogo de productos</w:t>
-            </w:r>
-            <w:r>
-              <w:rPr>
-                <w:noProof/>
-              </w:rPr>
+              <w:t xml:space="preserve">6.3 Catálogo de productos</w:t>
+            </w:r>
+            <w:r>
               <w:tab/>
             </w:r>
             <w:r>
-              <w:rPr>
-                <w:noProof/>
-              </w:rPr>
               <w:fldChar w:fldCharType="begin"/>
             </w:r>
             <w:r>
-              <w:rPr>
-                <w:noProof/>
-              </w:rPr>
               <w:instrText xml:space="preserve"> PAGEREF _Toc243417819 \h </w:instrText>
             </w:r>
             <w:r>
-              <w:rPr>
-                <w:noProof/>
-              </w:rPr>
-            </w:r>
-            <w:r>
-              <w:rPr>
-                <w:noProof/>
-              </w:rPr>
               <w:fldChar w:fldCharType="separate"/>
             </w:r>
             <w:r>
-              <w:rPr>
-                <w:noProof/>
-              </w:rPr>
               <w:t>9</w:t>
             </w:r>
             <w:r>
-              <w:rPr>
-                <w:noProof/>
-              </w:rPr>
               <w:fldChar w:fldCharType="end"/>
             </w:r>
           </w:hyperlink>
@@ -1405,60 +1009,27 @@
             <w:tabs>
               <w:tab w:val="right" w:leader="dot" w:pos="9350"/>
             </w:tabs>
-            <w:rPr>
-              <w:rFonts w:asciiTheme="minorHAnsi" w:eastAsiaTheme="minorEastAsia" w:hAnsiTheme="minorHAnsi" w:cstheme="minorBidi"/>
-              <w:noProof/>
-              <w:color w:val="auto"/>
-              <w:lang w:val="es-CL" w:eastAsia="es-CL"/>
-            </w:rPr>
           </w:pPr>
           <w:hyperlink w:anchor="_Toc243417820" w:history="1">
             <w:r>
-              <w:rPr>
-                <w:rStyle w:val="Hipervnculo"/>
-                <w:noProof/>
-              </w:rPr>
-              <w:t>6.4 Proceso comercial</w:t>
-            </w:r>
-            <w:r>
-              <w:rPr>
-                <w:noProof/>
-              </w:rPr>
+              <w:t xml:space="preserve">6.4 Proceso comercial</w:t>
+            </w:r>
+            <w:r>
               <w:tab/>
             </w:r>
             <w:r>
-              <w:rPr>
-                <w:noProof/>
-              </w:rPr>
               <w:fldChar w:fldCharType="begin"/>
             </w:r>
             <w:r>
-              <w:rPr>
-                <w:noProof/>
-              </w:rPr>
               <w:instrText xml:space="preserve"> PAGEREF _Toc243417820 \h </w:instrText>
             </w:r>
             <w:r>
-              <w:rPr>
-                <w:noProof/>
-              </w:rPr>
-            </w:r>
-            <w:r>
-              <w:rPr>
-                <w:noProof/>
-              </w:rPr>
               <w:fldChar w:fldCharType="separate"/>
             </w:r>
             <w:r>
-              <w:rPr>
-                <w:noProof/>
-              </w:rPr>
               <w:t>9</w:t>
             </w:r>
             <w:r>
-              <w:rPr>
-                <w:noProof/>
-              </w:rPr>
               <w:fldChar w:fldCharType="end"/>
             </w:r>
           </w:hyperlink>
@@ -1469,60 +1040,27 @@
             <w:tabs>
               <w:tab w:val="right" w:leader="dot" w:pos="9350"/>
             </w:tabs>
-            <w:rPr>
-              <w:rFonts w:asciiTheme="minorHAnsi" w:eastAsiaTheme="minorEastAsia" w:hAnsiTheme="minorHAnsi" w:cstheme="minorBidi"/>
-              <w:noProof/>
-              <w:color w:val="auto"/>
-              <w:lang w:val="es-CL" w:eastAsia="es-CL"/>
-            </w:rPr>
           </w:pPr>
           <w:hyperlink w:anchor="_Toc243417821" w:history="1">
             <w:r>
-              <w:rPr>
-                <w:rStyle w:val="Hipervnculo"/>
-                <w:noProof/>
-              </w:rPr>
-              <w:t>6.5 Ejecución productiva</w:t>
-            </w:r>
-            <w:r>
-              <w:rPr>
-                <w:noProof/>
-              </w:rPr>
+              <w:t xml:space="preserve">6.5 Ejecución productiva</w:t>
+            </w:r>
+            <w:r>
               <w:tab/>
             </w:r>
             <w:r>
-              <w:rPr>
-                <w:noProof/>
-              </w:rPr>
               <w:fldChar w:fldCharType="begin"/>
             </w:r>
             <w:r>
-              <w:rPr>
-                <w:noProof/>
-              </w:rPr>
               <w:instrText xml:space="preserve"> PAGEREF _Toc243417821 \h </w:instrText>
             </w:r>
             <w:r>
-              <w:rPr>
-                <w:noProof/>
-              </w:rPr>
-            </w:r>
-            <w:r>
-              <w:rPr>
-                <w:noProof/>
-              </w:rPr>
               <w:fldChar w:fldCharType="separate"/>
             </w:r>
             <w:r>
-              <w:rPr>
-                <w:noProof/>
-              </w:rPr>
               <w:t>11</w:t>
             </w:r>
             <w:r>
-              <w:rPr>
-                <w:noProof/>
-              </w:rPr>
               <w:fldChar w:fldCharType="end"/>
             </w:r>
           </w:hyperlink>
@@ -1533,60 +1071,27 @@
             <w:tabs>
               <w:tab w:val="right" w:leader="dot" w:pos="9350"/>
             </w:tabs>
-            <w:rPr>
-              <w:rFonts w:asciiTheme="minorHAnsi" w:eastAsiaTheme="minorEastAsia" w:hAnsiTheme="minorHAnsi" w:cstheme="minorBidi"/>
-              <w:noProof/>
-              <w:color w:val="auto"/>
-              <w:lang w:val="es-CL" w:eastAsia="es-CL"/>
-            </w:rPr>
           </w:pPr>
           <w:hyperlink w:anchor="_Toc243417822" w:history="1">
             <w:r>
-              <w:rPr>
-                <w:rStyle w:val="Hipervnculo"/>
-                <w:noProof/>
-              </w:rPr>
-              <w:t>6.6 Inventario</w:t>
-            </w:r>
-            <w:r>
-              <w:rPr>
-                <w:noProof/>
-              </w:rPr>
+              <w:t xml:space="preserve">6.6 Inventario</w:t>
+            </w:r>
+            <w:r>
               <w:tab/>
             </w:r>
             <w:r>
-              <w:rPr>
-                <w:noProof/>
-              </w:rPr>
               <w:fldChar w:fldCharType="begin"/>
             </w:r>
             <w:r>
-              <w:rPr>
-                <w:noProof/>
-              </w:rPr>
               <w:instrText xml:space="preserve"> PAGEREF _Toc243417822 \h </w:instrText>
             </w:r>
             <w:r>
-              <w:rPr>
-                <w:noProof/>
-              </w:rPr>
-            </w:r>
-            <w:r>
-              <w:rPr>
-                <w:noProof/>
-              </w:rPr>
               <w:fldChar w:fldCharType="separate"/>
             </w:r>
             <w:r>
-              <w:rPr>
-                <w:noProof/>
-              </w:rPr>
               <w:t>12</w:t>
             </w:r>
             <w:r>
-              <w:rPr>
-                <w:noProof/>
-              </w:rPr>
               <w:fldChar w:fldCharType="end"/>
             </w:r>
           </w:hyperlink>
@@ -1597,60 +1102,27 @@
             <w:tabs>
               <w:tab w:val="right" w:leader="dot" w:pos="9350"/>
             </w:tabs>
-            <w:rPr>
-              <w:rFonts w:asciiTheme="minorHAnsi" w:eastAsiaTheme="minorEastAsia" w:hAnsiTheme="minorHAnsi" w:cstheme="minorBidi"/>
-              <w:noProof/>
-              <w:color w:val="auto"/>
-              <w:lang w:val="es-CL" w:eastAsia="es-CL"/>
-            </w:rPr>
           </w:pPr>
           <w:hyperlink w:anchor="_Toc243417823" w:history="1">
             <w:r>
-              <w:rPr>
-                <w:rStyle w:val="Hipervnculo"/>
-                <w:noProof/>
-              </w:rPr>
-              <w:t>6.7 Control de calidad</w:t>
-            </w:r>
-            <w:r>
-              <w:rPr>
-                <w:noProof/>
-              </w:rPr>
+              <w:t xml:space="preserve">6.7 Control de calidad</w:t>
+            </w:r>
+            <w:r>
               <w:tab/>
             </w:r>
             <w:r>
-              <w:rPr>
-                <w:noProof/>
-              </w:rPr>
               <w:fldChar w:fldCharType="begin"/>
             </w:r>
             <w:r>
-              <w:rPr>
-                <w:noProof/>
-              </w:rPr>
               <w:instrText xml:space="preserve"> PAGEREF _Toc243417823 \h </w:instrText>
             </w:r>
             <w:r>
-              <w:rPr>
-                <w:noProof/>
-              </w:rPr>
-            </w:r>
-            <w:r>
-              <w:rPr>
-                <w:noProof/>
-              </w:rPr>
               <w:fldChar w:fldCharType="separate"/>
             </w:r>
             <w:r>
-              <w:rPr>
-                <w:noProof/>
-              </w:rPr>
               <w:t>12</w:t>
             </w:r>
             <w:r>
-              <w:rPr>
-                <w:noProof/>
-              </w:rPr>
               <w:fldChar w:fldCharType="end"/>
             </w:r>
           </w:hyperlink>
@@ -1661,60 +1133,27 @@
             <w:tabs>
               <w:tab w:val="right" w:leader="dot" w:pos="9350"/>
             </w:tabs>
-            <w:rPr>
-              <w:rFonts w:asciiTheme="minorHAnsi" w:eastAsiaTheme="minorEastAsia" w:hAnsiTheme="minorHAnsi" w:cstheme="minorBidi"/>
-              <w:noProof/>
-              <w:color w:val="auto"/>
-              <w:lang w:val="es-CL" w:eastAsia="es-CL"/>
-            </w:rPr>
           </w:pPr>
           <w:hyperlink w:anchor="_Toc243417824" w:history="1">
             <w:r>
-              <w:rPr>
-                <w:rStyle w:val="Hipervnculo"/>
-                <w:noProof/>
-              </w:rPr>
-              <w:t>6.8 Pagos y moneda</w:t>
-            </w:r>
-            <w:r>
-              <w:rPr>
-                <w:noProof/>
-              </w:rPr>
+              <w:t xml:space="preserve">6.8 Pagos y moneda</w:t>
+            </w:r>
+            <w:r>
               <w:tab/>
             </w:r>
             <w:r>
-              <w:rPr>
-                <w:noProof/>
-              </w:rPr>
               <w:fldChar w:fldCharType="begin"/>
             </w:r>
             <w:r>
-              <w:rPr>
-                <w:noProof/>
-              </w:rPr>
               <w:instrText xml:space="preserve"> PAGEREF _Toc243417824 \h </w:instrText>
             </w:r>
             <w:r>
-              <w:rPr>
-                <w:noProof/>
-              </w:rPr>
-            </w:r>
-            <w:r>
-              <w:rPr>
-                <w:noProof/>
-              </w:rPr>
               <w:fldChar w:fldCharType="separate"/>
             </w:r>
             <w:r>
-              <w:rPr>
-                <w:noProof/>
-              </w:rPr>
               <w:t>13</w:t>
             </w:r>
             <w:r>
-              <w:rPr>
-                <w:noProof/>
-              </w:rPr>
               <w:fldChar w:fldCharType="end"/>
             </w:r>
           </w:hyperlink>
@@ -1725,60 +1164,27 @@
             <w:tabs>
               <w:tab w:val="right" w:leader="dot" w:pos="9350"/>
             </w:tabs>
-            <w:rPr>
-              <w:rFonts w:asciiTheme="minorHAnsi" w:eastAsiaTheme="minorEastAsia" w:hAnsiTheme="minorHAnsi" w:cstheme="minorBidi"/>
-              <w:noProof/>
-              <w:color w:val="auto"/>
-              <w:lang w:val="es-CL" w:eastAsia="es-CL"/>
-            </w:rPr>
           </w:pPr>
           <w:hyperlink w:anchor="_Toc243417825" w:history="1">
             <w:r>
-              <w:rPr>
-                <w:rStyle w:val="Hipervnculo"/>
-                <w:noProof/>
-              </w:rPr>
-              <w:t>6.9 Integraciones</w:t>
-            </w:r>
-            <w:r>
-              <w:rPr>
-                <w:noProof/>
-              </w:rPr>
+              <w:t xml:space="preserve">6.9 Integraciones</w:t>
+            </w:r>
+            <w:r>
               <w:tab/>
             </w:r>
             <w:r>
-              <w:rPr>
-                <w:noProof/>
-              </w:rPr>
               <w:fldChar w:fldCharType="begin"/>
             </w:r>
             <w:r>
-              <w:rPr>
-                <w:noProof/>
-              </w:rPr>
               <w:instrText xml:space="preserve"> PAGEREF _Toc243417825 \h </w:instrText>
             </w:r>
             <w:r>
-              <w:rPr>
-                <w:noProof/>
-              </w:rPr>
-            </w:r>
-            <w:r>
-              <w:rPr>
-                <w:noProof/>
-              </w:rPr>
               <w:fldChar w:fldCharType="separate"/>
             </w:r>
             <w:r>
-              <w:rPr>
-                <w:noProof/>
-              </w:rPr>
               <w:t>13</w:t>
             </w:r>
             <w:r>
-              <w:rPr>
-                <w:noProof/>
-              </w:rPr>
               <w:fldChar w:fldCharType="end"/>
             </w:r>
           </w:hyperlink>
@@ -1789,60 +1195,27 @@
             <w:tabs>
               <w:tab w:val="right" w:leader="dot" w:pos="9350"/>
             </w:tabs>
-            <w:rPr>
-              <w:rFonts w:asciiTheme="minorHAnsi" w:eastAsiaTheme="minorEastAsia" w:hAnsiTheme="minorHAnsi" w:cstheme="minorBidi"/>
-              <w:noProof/>
-              <w:color w:val="auto"/>
-              <w:lang w:val="es-CL" w:eastAsia="es-CL"/>
-            </w:rPr>
           </w:pPr>
           <w:hyperlink w:anchor="_Toc243417826" w:history="1">
             <w:r>
-              <w:rPr>
-                <w:rStyle w:val="Hipervnculo"/>
-                <w:noProof/>
-              </w:rPr>
-              <w:t>6.10 Reportes e indicadores (alcance ampliado)</w:t>
-            </w:r>
-            <w:r>
-              <w:rPr>
-                <w:noProof/>
-              </w:rPr>
+              <w:t xml:space="preserve">6.10 Reportes e indicadores (alcance ampliado)</w:t>
+            </w:r>
+            <w:r>
               <w:tab/>
             </w:r>
             <w:r>
-              <w:rPr>
-                <w:noProof/>
-              </w:rPr>
               <w:fldChar w:fldCharType="begin"/>
             </w:r>
             <w:r>
-              <w:rPr>
-                <w:noProof/>
-              </w:rPr>
               <w:instrText xml:space="preserve"> PAGEREF _Toc243417826 \h </w:instrText>
             </w:r>
             <w:r>
-              <w:rPr>
-                <w:noProof/>
-              </w:rPr>
-            </w:r>
-            <w:r>
-              <w:rPr>
-                <w:noProof/>
-              </w:rPr>
               <w:fldChar w:fldCharType="separate"/>
             </w:r>
             <w:r>
-              <w:rPr>
-                <w:noProof/>
-              </w:rPr>
               <w:t>14</w:t>
             </w:r>
             <w:r>
-              <w:rPr>
-                <w:noProof/>
-              </w:rPr>
               <w:fldChar w:fldCharType="end"/>
             </w:r>
           </w:hyperlink>
@@ -1853,60 +1226,27 @@
             <w:tabs>
               <w:tab w:val="right" w:leader="dot" w:pos="9350"/>
             </w:tabs>
-            <w:rPr>
-              <w:rFonts w:asciiTheme="minorHAnsi" w:eastAsiaTheme="minorEastAsia" w:hAnsiTheme="minorHAnsi" w:cstheme="minorBidi"/>
-              <w:noProof/>
-              <w:color w:val="auto"/>
-              <w:lang w:val="es-CL" w:eastAsia="es-CL"/>
-            </w:rPr>
           </w:pPr>
           <w:hyperlink w:anchor="_Toc243417827" w:history="1">
             <w:r>
-              <w:rPr>
-                <w:rStyle w:val="Hipervnculo"/>
-                <w:noProof/>
-              </w:rPr>
-              <w:t>6.11 Administración del canal web</w:t>
-            </w:r>
-            <w:r>
-              <w:rPr>
-                <w:noProof/>
-              </w:rPr>
+              <w:t xml:space="preserve">6.11 Administración del canal web</w:t>
+            </w:r>
+            <w:r>
               <w:tab/>
             </w:r>
             <w:r>
-              <w:rPr>
-                <w:noProof/>
-              </w:rPr>
               <w:fldChar w:fldCharType="begin"/>
             </w:r>
             <w:r>
-              <w:rPr>
-                <w:noProof/>
-              </w:rPr>
               <w:instrText xml:space="preserve"> PAGEREF _Toc243417827 \h </w:instrText>
             </w:r>
             <w:r>
-              <w:rPr>
-                <w:noProof/>
-              </w:rPr>
-            </w:r>
-            <w:r>
-              <w:rPr>
-                <w:noProof/>
-              </w:rPr>
               <w:fldChar w:fldCharType="separate"/>
             </w:r>
             <w:r>
-              <w:rPr>
-                <w:noProof/>
-              </w:rPr>
               <w:t>14</w:t>
             </w:r>
             <w:r>
-              <w:rPr>
-                <w:noProof/>
-              </w:rPr>
               <w:fldChar w:fldCharType="end"/>
             </w:r>
           </w:hyperlink>
@@ -1917,60 +1257,27 @@
             <w:tabs>
               <w:tab w:val="right" w:leader="dot" w:pos="9350"/>
             </w:tabs>
-            <w:rPr>
-              <w:rFonts w:asciiTheme="minorHAnsi" w:eastAsiaTheme="minorEastAsia" w:hAnsiTheme="minorHAnsi" w:cstheme="minorBidi"/>
-              <w:noProof/>
-              <w:color w:val="auto"/>
-              <w:lang w:val="es-CL" w:eastAsia="es-CL"/>
-            </w:rPr>
           </w:pPr>
           <w:hyperlink w:anchor="_Toc243417828" w:history="1">
             <w:r>
-              <w:rPr>
-                <w:rStyle w:val="Hipervnculo"/>
-                <w:noProof/>
-              </w:rPr>
-              <w:t>7. Requerimientos no funcionales</w:t>
-            </w:r>
-            <w:r>
-              <w:rPr>
-                <w:noProof/>
-              </w:rPr>
+              <w:t xml:space="preserve">7. Requerimientos no funcionales</w:t>
+            </w:r>
+            <w:r>
               <w:tab/>
             </w:r>
             <w:r>
-              <w:rPr>
-                <w:noProof/>
-              </w:rPr>
               <w:fldChar w:fldCharType="begin"/>
             </w:r>
             <w:r>
-              <w:rPr>
-                <w:noProof/>
-              </w:rPr>
               <w:instrText xml:space="preserve"> PAGEREF _Toc243417828 \h </w:instrText>
             </w:r>
             <w:r>
-              <w:rPr>
-                <w:noProof/>
-              </w:rPr>
-            </w:r>
-            <w:r>
-              <w:rPr>
-                <w:noProof/>
-              </w:rPr>
               <w:fldChar w:fldCharType="separate"/>
             </w:r>
             <w:r>
-              <w:rPr>
-                <w:noProof/>
-              </w:rPr>
               <w:t>16</w:t>
             </w:r>
             <w:r>
-              <w:rPr>
-                <w:noProof/>
-              </w:rPr>
               <w:fldChar w:fldCharType="end"/>
             </w:r>
           </w:hyperlink>
@@ -1981,60 +1288,27 @@
             <w:tabs>
               <w:tab w:val="right" w:leader="dot" w:pos="9350"/>
             </w:tabs>
-            <w:rPr>
-              <w:rFonts w:asciiTheme="minorHAnsi" w:eastAsiaTheme="minorEastAsia" w:hAnsiTheme="minorHAnsi" w:cstheme="minorBidi"/>
-              <w:noProof/>
-              <w:color w:val="auto"/>
-              <w:lang w:val="es-CL" w:eastAsia="es-CL"/>
-            </w:rPr>
           </w:pPr>
           <w:hyperlink w:anchor="_Toc243417829" w:history="1">
             <w:r>
-              <w:rPr>
-                <w:rStyle w:val="Hipervnculo"/>
-                <w:noProof/>
-              </w:rPr>
-              <w:t>8. Vistas del sistema y matriz de acceso por rol</w:t>
-            </w:r>
-            <w:r>
-              <w:rPr>
-                <w:noProof/>
-              </w:rPr>
+              <w:t xml:space="preserve">8. Vistas del sistema y matriz de acceso por rol</w:t>
+            </w:r>
+            <w:r>
               <w:tab/>
             </w:r>
             <w:r>
-              <w:rPr>
-                <w:noProof/>
-              </w:rPr>
               <w:fldChar w:fldCharType="begin"/>
             </w:r>
             <w:r>
-              <w:rPr>
-                <w:noProof/>
-              </w:rPr>
               <w:instrText xml:space="preserve"> PAGEREF _Toc243417829 \h </w:instrText>
             </w:r>
             <w:r>
-              <w:rPr>
-                <w:noProof/>
-              </w:rPr>
-            </w:r>
-            <w:r>
-              <w:rPr>
-                <w:noProof/>
-              </w:rPr>
               <w:fldChar w:fldCharType="separate"/>
             </w:r>
             <w:r>
-              <w:rPr>
-                <w:noProof/>
-              </w:rPr>
               <w:t>18</w:t>
             </w:r>
             <w:r>
-              <w:rPr>
-                <w:noProof/>
-              </w:rPr>
               <w:fldChar w:fldCharType="end"/>
             </w:r>
           </w:hyperlink>
@@ -2045,60 +1319,27 @@
             <w:tabs>
               <w:tab w:val="right" w:leader="dot" w:pos="9350"/>
             </w:tabs>
-            <w:rPr>
-              <w:rFonts w:asciiTheme="minorHAnsi" w:eastAsiaTheme="minorEastAsia" w:hAnsiTheme="minorHAnsi" w:cstheme="minorBidi"/>
-              <w:noProof/>
-              <w:color w:val="auto"/>
-              <w:lang w:val="es-CL" w:eastAsia="es-CL"/>
-            </w:rPr>
           </w:pPr>
           <w:hyperlink w:anchor="_Toc243417830" w:history="1">
             <w:r>
-              <w:rPr>
-                <w:rStyle w:val="Hipervnculo"/>
-                <w:noProof/>
-              </w:rPr>
-              <w:t>8.1 Criterio de definición de roles</w:t>
-            </w:r>
-            <w:r>
-              <w:rPr>
-                <w:noProof/>
-              </w:rPr>
+              <w:t xml:space="preserve">8.1 Criterio de definición de roles</w:t>
+            </w:r>
+            <w:r>
               <w:tab/>
             </w:r>
             <w:r>
-              <w:rPr>
-                <w:noProof/>
-              </w:rPr>
               <w:fldChar w:fldCharType="begin"/>
             </w:r>
             <w:r>
-              <w:rPr>
-                <w:noProof/>
-              </w:rPr>
               <w:instrText xml:space="preserve"> PAGEREF _Toc243417830 \h </w:instrText>
             </w:r>
             <w:r>
-              <w:rPr>
-                <w:noProof/>
-              </w:rPr>
-            </w:r>
-            <w:r>
-              <w:rPr>
-                <w:noProof/>
-              </w:rPr>
               <w:fldChar w:fldCharType="separate"/>
             </w:r>
             <w:r>
-              <w:rPr>
-                <w:noProof/>
-              </w:rPr>
               <w:t>18</w:t>
             </w:r>
             <w:r>
-              <w:rPr>
-                <w:noProof/>
-              </w:rPr>
               <w:fldChar w:fldCharType="end"/>
             </w:r>
           </w:hyperlink>
@@ -2109,60 +1350,27 @@
             <w:tabs>
               <w:tab w:val="right" w:leader="dot" w:pos="9350"/>
             </w:tabs>
-            <w:rPr>
-              <w:rFonts w:asciiTheme="minorHAnsi" w:eastAsiaTheme="minorEastAsia" w:hAnsiTheme="minorHAnsi" w:cstheme="minorBidi"/>
-              <w:noProof/>
-              <w:color w:val="auto"/>
-              <w:lang w:val="es-CL" w:eastAsia="es-CL"/>
-            </w:rPr>
           </w:pPr>
           <w:hyperlink w:anchor="_Toc243417831" w:history="1">
             <w:r>
-              <w:rPr>
-                <w:rStyle w:val="Hipervnculo"/>
-                <w:noProof/>
-              </w:rPr>
-              <w:t>8.2 Vistas de la aplicación de escritorio</w:t>
-            </w:r>
-            <w:r>
-              <w:rPr>
-                <w:noProof/>
-              </w:rPr>
+              <w:t xml:space="preserve">8.2 Vistas de la aplicación de escritorio</w:t>
+            </w:r>
+            <w:r>
               <w:tab/>
             </w:r>
             <w:r>
-              <w:rPr>
-                <w:noProof/>
-              </w:rPr>
               <w:fldChar w:fldCharType="begin"/>
             </w:r>
             <w:r>
-              <w:rPr>
-                <w:noProof/>
-              </w:rPr>
               <w:instrText xml:space="preserve"> PAGEREF _Toc243417831 \h </w:instrText>
             </w:r>
             <w:r>
-              <w:rPr>
-                <w:noProof/>
-              </w:rPr>
-            </w:r>
-            <w:r>
-              <w:rPr>
-                <w:noProof/>
-              </w:rPr>
               <w:fldChar w:fldCharType="separate"/>
             </w:r>
             <w:r>
-              <w:rPr>
-                <w:noProof/>
-              </w:rPr>
               <w:t>18</w:t>
             </w:r>
             <w:r>
-              <w:rPr>
-                <w:noProof/>
-              </w:rPr>
               <w:fldChar w:fldCharType="end"/>
             </w:r>
           </w:hyperlink>
@@ -2173,60 +1381,27 @@
             <w:tabs>
               <w:tab w:val="right" w:leader="dot" w:pos="9350"/>
             </w:tabs>
-            <w:rPr>
-              <w:rFonts w:asciiTheme="minorHAnsi" w:eastAsiaTheme="minorEastAsia" w:hAnsiTheme="minorHAnsi" w:cstheme="minorBidi"/>
-              <w:noProof/>
-              <w:color w:val="auto"/>
-              <w:lang w:val="es-CL" w:eastAsia="es-CL"/>
-            </w:rPr>
           </w:pPr>
           <w:hyperlink w:anchor="_Toc243417832" w:history="1">
             <w:r>
-              <w:rPr>
-                <w:rStyle w:val="Hipervnculo"/>
-                <w:noProof/>
-              </w:rPr>
-              <w:t>8.3 Vistas de la aplicación web</w:t>
-            </w:r>
-            <w:r>
-              <w:rPr>
-                <w:noProof/>
-              </w:rPr>
+              <w:t xml:space="preserve">8.3 Vistas de la aplicación web</w:t>
+            </w:r>
+            <w:r>
               <w:tab/>
             </w:r>
             <w:r>
-              <w:rPr>
-                <w:noProof/>
-              </w:rPr>
               <w:fldChar w:fldCharType="begin"/>
             </w:r>
             <w:r>
-              <w:rPr>
-                <w:noProof/>
-              </w:rPr>
               <w:instrText xml:space="preserve"> PAGEREF _Toc243417832 \h </w:instrText>
             </w:r>
             <w:r>
-              <w:rPr>
-                <w:noProof/>
-              </w:rPr>
-            </w:r>
-            <w:r>
-              <w:rPr>
-                <w:noProof/>
-              </w:rPr>
               <w:fldChar w:fldCharType="separate"/>
             </w:r>
             <w:r>
-              <w:rPr>
-                <w:noProof/>
-              </w:rPr>
               <w:t>19</w:t>
             </w:r>
             <w:r>
-              <w:rPr>
-                <w:noProof/>
-              </w:rPr>
               <w:fldChar w:fldCharType="end"/>
             </w:r>
           </w:hyperlink>
@@ -2237,60 +1412,27 @@
             <w:tabs>
               <w:tab w:val="right" w:leader="dot" w:pos="9350"/>
             </w:tabs>
-            <w:rPr>
-              <w:rFonts w:asciiTheme="minorHAnsi" w:eastAsiaTheme="minorEastAsia" w:hAnsiTheme="minorHAnsi" w:cstheme="minorBidi"/>
-              <w:noProof/>
-              <w:color w:val="auto"/>
-              <w:lang w:val="es-CL" w:eastAsia="es-CL"/>
-            </w:rPr>
           </w:pPr>
           <w:hyperlink w:anchor="_Toc243417833" w:history="1">
             <w:r>
-              <w:rPr>
-                <w:rStyle w:val="Hipervnculo"/>
-                <w:noProof/>
-              </w:rPr>
-              <w:t>9. Restricciones del proyecto</w:t>
-            </w:r>
-            <w:r>
-              <w:rPr>
-                <w:noProof/>
-              </w:rPr>
+              <w:t xml:space="preserve">9. Restricciones del proyecto</w:t>
+            </w:r>
+            <w:r>
               <w:tab/>
             </w:r>
             <w:r>
-              <w:rPr>
-                <w:noProof/>
-              </w:rPr>
               <w:fldChar w:fldCharType="begin"/>
             </w:r>
             <w:r>
-              <w:rPr>
-                <w:noProof/>
-              </w:rPr>
               <w:instrText xml:space="preserve"> PAGEREF _Toc243417833 \h </w:instrText>
             </w:r>
             <w:r>
-              <w:rPr>
-                <w:noProof/>
-              </w:rPr>
-            </w:r>
-            <w:r>
-              <w:rPr>
-                <w:noProof/>
-              </w:rPr>
               <w:fldChar w:fldCharType="separate"/>
             </w:r>
             <w:r>
-              <w:rPr>
-                <w:noProof/>
-              </w:rPr>
               <w:t>21</w:t>
             </w:r>
             <w:r>
-              <w:rPr>
-                <w:noProof/>
-              </w:rPr>
               <w:fldChar w:fldCharType="end"/>
             </w:r>
           </w:hyperlink>
@@ -2301,60 +1443,27 @@
             <w:tabs>
               <w:tab w:val="right" w:leader="dot" w:pos="9350"/>
             </w:tabs>
-            <w:rPr>
-              <w:rFonts w:asciiTheme="minorHAnsi" w:eastAsiaTheme="minorEastAsia" w:hAnsiTheme="minorHAnsi" w:cstheme="minorBidi"/>
-              <w:noProof/>
-              <w:color w:val="auto"/>
-              <w:lang w:val="es-CL" w:eastAsia="es-CL"/>
-            </w:rPr>
           </w:pPr>
           <w:hyperlink w:anchor="_Toc243417834" w:history="1">
             <w:r>
-              <w:rPr>
-                <w:rStyle w:val="Hipervnculo"/>
-                <w:noProof/>
-              </w:rPr>
-              <w:t>10. Supuestos y exclusiones</w:t>
-            </w:r>
-            <w:r>
-              <w:rPr>
-                <w:noProof/>
-              </w:rPr>
+              <w:t xml:space="preserve">10. Supuestos y exclusiones</w:t>
+            </w:r>
+            <w:r>
               <w:tab/>
             </w:r>
             <w:r>
-              <w:rPr>
-                <w:noProof/>
-              </w:rPr>
               <w:fldChar w:fldCharType="begin"/>
             </w:r>
             <w:r>
-              <w:rPr>
-                <w:noProof/>
-              </w:rPr>
               <w:instrText xml:space="preserve"> PAGEREF _Toc243417834 \h </w:instrText>
             </w:r>
             <w:r>
-              <w:rPr>
-                <w:noProof/>
-              </w:rPr>
-            </w:r>
-            <w:r>
-              <w:rPr>
-                <w:noProof/>
-              </w:rPr>
               <w:fldChar w:fldCharType="separate"/>
             </w:r>
             <w:r>
-              <w:rPr>
-                <w:noProof/>
-              </w:rPr>
               <w:t>21</w:t>
             </w:r>
             <w:r>
-              <w:rPr>
-                <w:noProof/>
-              </w:rPr>
               <w:fldChar w:fldCharType="end"/>
             </w:r>
           </w:hyperlink>
@@ -2365,60 +1474,27 @@
             <w:tabs>
               <w:tab w:val="right" w:leader="dot" w:pos="9350"/>
             </w:tabs>
-            <w:rPr>
-              <w:rFonts w:asciiTheme="minorHAnsi" w:eastAsiaTheme="minorEastAsia" w:hAnsiTheme="minorHAnsi" w:cstheme="minorBidi"/>
-              <w:noProof/>
-              <w:color w:val="auto"/>
-              <w:lang w:val="es-CL" w:eastAsia="es-CL"/>
-            </w:rPr>
           </w:pPr>
           <w:hyperlink w:anchor="_Toc243417835" w:history="1">
             <w:r>
-              <w:rPr>
-                <w:rStyle w:val="Hipervnculo"/>
-                <w:noProof/>
-              </w:rPr>
-              <w:t>10.1 Supuestos</w:t>
-            </w:r>
-            <w:r>
-              <w:rPr>
-                <w:noProof/>
-              </w:rPr>
+              <w:t xml:space="preserve">10.1 Supuestos</w:t>
+            </w:r>
+            <w:r>
               <w:tab/>
             </w:r>
             <w:r>
-              <w:rPr>
-                <w:noProof/>
-              </w:rPr>
               <w:fldChar w:fldCharType="begin"/>
             </w:r>
             <w:r>
-              <w:rPr>
-                <w:noProof/>
-              </w:rPr>
               <w:instrText xml:space="preserve"> PAGEREF _Toc243417835 \h </w:instrText>
             </w:r>
             <w:r>
-              <w:rPr>
-                <w:noProof/>
-              </w:rPr>
-            </w:r>
-            <w:r>
-              <w:rPr>
-                <w:noProof/>
-              </w:rPr>
               <w:fldChar w:fldCharType="separate"/>
             </w:r>
             <w:r>
-              <w:rPr>
-                <w:noProof/>
-              </w:rPr>
               <w:t>21</w:t>
             </w:r>
             <w:r>
-              <w:rPr>
-                <w:noProof/>
-              </w:rPr>
               <w:fldChar w:fldCharType="end"/>
             </w:r>
           </w:hyperlink>
@@ -2429,60 +1505,27 @@
             <w:tabs>
               <w:tab w:val="right" w:leader="dot" w:pos="9350"/>
             </w:tabs>
-            <w:rPr>
-              <w:rFonts w:asciiTheme="minorHAnsi" w:eastAsiaTheme="minorEastAsia" w:hAnsiTheme="minorHAnsi" w:cstheme="minorBidi"/>
-              <w:noProof/>
-              <w:color w:val="auto"/>
-              <w:lang w:val="es-CL" w:eastAsia="es-CL"/>
-            </w:rPr>
           </w:pPr>
           <w:hyperlink w:anchor="_Toc243417836" w:history="1">
             <w:r>
-              <w:rPr>
-                <w:rStyle w:val="Hipervnculo"/>
-                <w:noProof/>
-              </w:rPr>
-              <w:t>10.2 Exclusiones declaradas</w:t>
-            </w:r>
-            <w:r>
-              <w:rPr>
-                <w:noProof/>
-              </w:rPr>
+              <w:t xml:space="preserve">10.2 Exclusiones declaradas</w:t>
+            </w:r>
+            <w:r>
               <w:tab/>
             </w:r>
             <w:r>
-              <w:rPr>
-                <w:noProof/>
-              </w:rPr>
               <w:fldChar w:fldCharType="begin"/>
             </w:r>
             <w:r>
-              <w:rPr>
-                <w:noProof/>
-              </w:rPr>
               <w:instrText xml:space="preserve"> PAGEREF _Toc243417836 \h </w:instrText>
             </w:r>
             <w:r>
-              <w:rPr>
-                <w:noProof/>
-              </w:rPr>
-            </w:r>
-            <w:r>
-              <w:rPr>
-                <w:noProof/>
-              </w:rPr>
               <w:fldChar w:fldCharType="separate"/>
             </w:r>
             <w:r>
-              <w:rPr>
-                <w:noProof/>
-              </w:rPr>
               <w:t>21</w:t>
             </w:r>
             <w:r>
-              <w:rPr>
-                <w:noProof/>
-              </w:rPr>
               <w:fldChar w:fldCharType="end"/>
             </w:r>
           </w:hyperlink>
@@ -2493,60 +1536,27 @@
             <w:tabs>
               <w:tab w:val="right" w:leader="dot" w:pos="9350"/>
             </w:tabs>
-            <w:rPr>
-              <w:rFonts w:asciiTheme="minorHAnsi" w:eastAsiaTheme="minorEastAsia" w:hAnsiTheme="minorHAnsi" w:cstheme="minorBidi"/>
-              <w:noProof/>
-              <w:color w:val="auto"/>
-              <w:lang w:val="es-CL" w:eastAsia="es-CL"/>
-            </w:rPr>
           </w:pPr>
           <w:hyperlink w:anchor="_Toc243417837" w:history="1">
             <w:r>
-              <w:rPr>
-                <w:rStyle w:val="Hipervnculo"/>
-                <w:noProof/>
-              </w:rPr>
-              <w:t>11. Matriz de trazabilidad</w:t>
-            </w:r>
-            <w:r>
-              <w:rPr>
-                <w:noProof/>
-              </w:rPr>
+              <w:t xml:space="preserve">11. Matriz de trazabilidad</w:t>
+            </w:r>
+            <w:r>
               <w:tab/>
             </w:r>
             <w:r>
-              <w:rPr>
-                <w:noProof/>
-              </w:rPr>
               <w:fldChar w:fldCharType="begin"/>
             </w:r>
             <w:r>
-              <w:rPr>
-                <w:noProof/>
-              </w:rPr>
               <w:instrText xml:space="preserve"> PAGEREF _Toc243417837 \h </w:instrText>
             </w:r>
             <w:r>
-              <w:rPr>
-                <w:noProof/>
-              </w:rPr>
-            </w:r>
-            <w:r>
-              <w:rPr>
-                <w:noProof/>
-              </w:rPr>
               <w:fldChar w:fldCharType="separate"/>
             </w:r>
             <w:r>
-              <w:rPr>
-                <w:noProof/>
-              </w:rPr>
               <w:t>21</w:t>
             </w:r>
             <w:r>
-              <w:rPr>
-                <w:noProof/>
-              </w:rPr>
               <w:fldChar w:fldCharType="end"/>
             </w:r>
           </w:hyperlink>
@@ -2557,60 +1567,27 @@
             <w:tabs>
               <w:tab w:val="right" w:leader="dot" w:pos="9350"/>
             </w:tabs>
-            <w:rPr>
-              <w:rFonts w:asciiTheme="minorHAnsi" w:eastAsiaTheme="minorEastAsia" w:hAnsiTheme="minorHAnsi" w:cstheme="minorBidi"/>
-              <w:noProof/>
-              <w:color w:val="auto"/>
-              <w:lang w:val="es-CL" w:eastAsia="es-CL"/>
-            </w:rPr>
           </w:pPr>
           <w:hyperlink w:anchor="_Toc243417838" w:history="1">
             <w:r>
-              <w:rPr>
-                <w:rStyle w:val="Hipervnculo"/>
-                <w:noProof/>
-              </w:rPr>
-              <w:t>12. Control de versiones del documento</w:t>
-            </w:r>
-            <w:r>
-              <w:rPr>
-                <w:noProof/>
-              </w:rPr>
+              <w:t xml:space="preserve">12. Control de versiones del documento</w:t>
+            </w:r>
+            <w:r>
               <w:tab/>
             </w:r>
             <w:r>
-              <w:rPr>
-                <w:noProof/>
-              </w:rPr>
               <w:fldChar w:fldCharType="begin"/>
             </w:r>
             <w:r>
-              <w:rPr>
-                <w:noProof/>
-              </w:rPr>
               <w:instrText xml:space="preserve"> PAGEREF _Toc243417838 \h </w:instrText>
             </w:r>
             <w:r>
-              <w:rPr>
-                <w:noProof/>
-              </w:rPr>
-            </w:r>
-            <w:r>
-              <w:rPr>
-                <w:noProof/>
-              </w:rPr>
               <w:fldChar w:fldCharType="separate"/>
             </w:r>
             <w:r>
-              <w:rPr>
-                <w:noProof/>
-              </w:rPr>
               <w:t>23</w:t>
             </w:r>
             <w:r>
-              <w:rPr>
-                <w:noProof/>
-              </w:rPr>
               <w:fldChar w:fldCharType="end"/>
             </w:r>
           </w:hyperlink>
@@ -4982,7 +3959,7 @@
                 <w:sz w:val="18"/>
                 <w:szCs w:val="18"/>
               </w:rPr>
-              <w:t>Consulta el seguimiento de pedidos y estima precios referenciales, por ejemplo el sistema de un distribuidor.</w:t>
+              <w:t xml:space="preserve">Consulta el seguimiento de pedidos, estima precios referenciales y consulta los materiales bajo el stock mínimo, por ejemplo el sistema de un distribuidor o de un proveedor de materiales. Cada clave accede sólo a los servicios que tiene asignados.</w:t>
             </w:r>
           </w:p>
         </w:tc>
@@ -14904,7 +13881,7 @@
                 <w:sz w:val="18"/>
                 <w:szCs w:val="18"/>
               </w:rPr>
-              <w:t>El sistema debe exponer una API pública que informe los materiales bajo el stock mínimo y la cantidad sugerida de reposición, calculados desde el kardex, para consulta de proveedores autorizados (planificado para el Sprint 3).</w:t>
+              <w:t xml:space="preserve">El sistema debe exponer una API pública que informe los materiales bajo el stock mínimo y la cantidad sugerida de reposición, calculados desde el kardex, para consulta de proveedores autorizados.</w:t>
             </w:r>
           </w:p>
         </w:tc>
@@ -30920,7 +29897,7 @@
                 <w:sz w:val="18"/>
                 <w:szCs w:val="18"/>
               </w:rPr>
-              <w:t>Por especificar</w:t>
+              <w:t xml:space="preserve">CU-REP-08</w:t>
             </w:r>
           </w:p>
         </w:tc>
@@ -30968,7 +29945,7 @@
                 <w:sz w:val="18"/>
                 <w:szCs w:val="18"/>
               </w:rPr>
-              <w:t>Por desarrollar</w:t>
+              <w:t xml:space="preserve">api_publica/test_materiales.py</w:t>
             </w:r>
           </w:p>
         </w:tc>
@@ -31446,6 +30423,100 @@
                 <w:szCs w:val="18"/>
               </w:rPr>
               <w:t>Se incorporan las APIs públicas propias: RF-OT-12, RF-COM-18, RF-INV-09 (planificado), RF-INT-04 y RNF-21; actor ACT-13; vista de seguimiento sin sesión; RES-05 actualizada; proveedores reales de ACT-10 a ACT-12 (Brevo, Nager.Date y Nominatim); trazabilidad de HU-15 a HU-17.</w:t>
+            </w:r>
+          </w:p>
+        </w:tc>
+      </w:tr>
+      <w:tr>
+        <w:tc>
+          <w:tcPr>
+            <w:tcW w:w="1400" w:type="dxa"/>
+            <w:tcMar>
+              <w:top w:w="60" w:type="dxa"/>
+              <w:left w:w="100" w:type="dxa"/>
+              <w:bottom w:w="60" w:type="dxa"/>
+              <w:right w:w="100" w:type="dxa"/>
+            </w:tcMar>
+          </w:tcPr>
+          <w:p>
+            <w:pPr>
+              <w:spacing w:before="40" w:after="40"/>
+            </w:pPr>
+            <w:r>
+              <w:rPr>
+                <w:sz w:val="18"/>
+                <w:szCs w:val="18"/>
+              </w:rPr>
+              <w:t xml:space="preserve">1.3</w:t>
+            </w:r>
+          </w:p>
+        </w:tc>
+        <w:tc>
+          <w:tcPr>
+            <w:tcW w:w="1900" w:type="dxa"/>
+            <w:tcMar>
+              <w:top w:w="60" w:type="dxa"/>
+              <w:left w:w="100" w:type="dxa"/>
+              <w:bottom w:w="60" w:type="dxa"/>
+              <w:right w:w="100" w:type="dxa"/>
+            </w:tcMar>
+          </w:tcPr>
+          <w:p>
+            <w:pPr>
+              <w:spacing w:before="40" w:after="40"/>
+            </w:pPr>
+            <w:r>
+              <w:rPr>
+                <w:sz w:val="18"/>
+                <w:szCs w:val="18"/>
+              </w:rPr>
+              <w:t xml:space="preserve">22-10-2026</w:t>
+            </w:r>
+          </w:p>
+        </w:tc>
+        <w:tc>
+          <w:tcPr>
+            <w:tcW w:w="2600" w:type="dxa"/>
+            <w:tcMar>
+              <w:top w:w="60" w:type="dxa"/>
+              <w:left w:w="100" w:type="dxa"/>
+              <w:bottom w:w="60" w:type="dxa"/>
+              <w:right w:w="100" w:type="dxa"/>
+            </w:tcMar>
+          </w:tcPr>
+          <w:p>
+            <w:pPr>
+              <w:spacing w:before="40" w:after="40"/>
+            </w:pPr>
+            <w:r>
+              <w:rPr>
+                <w:sz w:val="18"/>
+                <w:szCs w:val="18"/>
+              </w:rPr>
+              <w:t xml:space="preserve">Camila Olivares</w:t>
+            </w:r>
+          </w:p>
+        </w:tc>
+        <w:tc>
+          <w:tcPr>
+            <w:tcW w:w="3460" w:type="dxa"/>
+            <w:tcMar>
+              <w:top w:w="60" w:type="dxa"/>
+              <w:left w:w="100" w:type="dxa"/>
+              <w:bottom w:w="60" w:type="dxa"/>
+              <w:right w:w="100" w:type="dxa"/>
+            </w:tcMar>
+          </w:tcPr>
+          <w:p>
+            <w:pPr>
+              <w:spacing w:before="40" w:after="40"/>
+            </w:pPr>
+            <w:r>
+              <w:rPr>
+                <w:sz w:val="18"/>
+                <w:szCs w:val="18"/>
+              </w:rPr>
+              <w:t xml:space="preserve">RF-INV-09 pasa de planificado a implementado con la tercera API pública (disponibilidad de materiales); actor ACT-13 incluye a los proveedores; trazabilidad de HU-17 con CU-REP-08 y api_publica/test_materiales.py.</w:t>
             </w:r>
           </w:p>
         </w:tc>

</xml_diff>